<commit_message>
Mover el README a la raíz y justificar Scrum en la Guía 1.5
- README.md vuelve a la raíz, como pide la revisión de la profesora (Fase 1 y 2).
  Se ajustan sus enlaces y los de JOS-06 y Base de datos/README.md.
- Guía 1.5, sección 5: se agrega por qué elegimos Scrum frente a cascada y cómo
  la aplicamos.
</commit_message>
<xml_diff>
--- a/Fase 1/Evidencias Grupales/1.5_GuiaEstudiante_Fase 1_Definicion Proyecto APT (Español).docx
+++ b/Fase 1/Evidencias Grupales/1.5_GuiaEstudiante_Fase 1_Definicion Proyecto APT (Español).docx
@@ -2909,12 +2909,170 @@
                 <w:iCs w:val="1"/>
                 <w:rtl w:val="0"/>
               </w:rPr>
-              <w:t xml:space="preserve">A pesar de esta distribución de funciones, los tres integrantes participarán en las distintas etapas del proyecto, incluyendo análisis, diseño, desarrollo, pruebas, documentación y presentación. Las responsabilidades podrán ajustarse según las necesidades y el avance del proyecto.,,</w:t>
-            </w:r>
-            <w:r>
-              <w:rPr>
-                <w:rtl w:val="0"/>
-              </w:rPr>
+              <w:t xml:space="preserve">A pesar de esta distribución de funciones, los tres integrantes participarán en las distintas etapas del proyecto, incluyendo análisis, diseño, desarrollo, pruebas, documentación y presentación. Las responsabilidades podrán ajustarse según las necesidades y el avance del proyecto.</w:t>
+            </w:r>
+            <w:r>
+              <w:rPr>
+                <w:rtl w:val="0"/>
+              </w:rPr>
+            </w:r>
+          </w:p>
+          <w:p>
+            <w:pPr>
+              <w:spacing w:after="240" w:before="240" w:lineRule="auto"/>
+              <w:jc w:val="both"/>
+              <w:rPr>
+                <w:i w:val="1"/>
+                <w:iCs w:val="1"/>
+              </w:rPr>
+            </w:pPr>
+            <w:r>
+              <w:rPr>
+                <w:b w:val="1"/>
+                <w:bCs w:val="1"/>
+                <w:i w:val="1"/>
+                <w:iCs w:val="1"/>
+                <w:rtl w:val="0"/>
+              </w:rPr>
+              <w:t xml:space="preserve">¿Por qué elegimos Scrum?</w:t>
+            </w:r>
+            <w:r>
+              <w:rPr>
+                <w:i w:val="1"/>
+                <w:iCs w:val="1"/>
+                <w:rtl w:val="0"/>
+              </w:rPr>
+              <w:t xml:space="preserve"> Lo elegimos frente a una metodología en cascada por cuatro razones propias de este proyecto:</w:t>
+            </w:r>
+          </w:p>
+          <w:p>
+            <w:pPr>
+              <w:spacing w:after="240" w:before="240" w:lineRule="auto"/>
+              <w:jc w:val="both"/>
+              <w:rPr>
+                <w:i w:val="1"/>
+                <w:iCs w:val="1"/>
+              </w:rPr>
+            </w:pPr>
+            <w:r>
+              <w:rPr>
+                <w:b w:val="1"/>
+                <w:bCs w:val="1"/>
+                <w:i w:val="1"/>
+                <w:iCs w:val="1"/>
+                <w:rtl w:val="0"/>
+              </w:rPr>
+              <w:t xml:space="preserve">1. Los requisitos no están cerrados desde el inicio.</w:t>
+            </w:r>
+            <w:r>
+              <w:rPr>
+                <w:i w:val="1"/>
+                <w:iCs w:val="1"/>
+                <w:rtl w:val="0"/>
+              </w:rPr>
+              <w:t xml:space="preserve"> Varias reglas de los módulos (plazos de los avisos, campos de conductores y documentos, jornadas de los turnos) se irán definiendo y validando durante el proyecto. Trabajar por etapas permite ajustarlas sin rehacer todo, algo que una metodología en cascada no facilita, porque exige cerrar los requisitos antes de diseñar y programar.</w:t>
+            </w:r>
+          </w:p>
+          <w:p>
+            <w:pPr>
+              <w:spacing w:after="240" w:before="240" w:lineRule="auto"/>
+              <w:jc w:val="both"/>
+              <w:rPr>
+                <w:i w:val="1"/>
+                <w:iCs w:val="1"/>
+              </w:rPr>
+            </w:pPr>
+            <w:r>
+              <w:rPr>
+                <w:b w:val="1"/>
+                <w:bCs w:val="1"/>
+                <w:i w:val="1"/>
+                <w:iCs w:val="1"/>
+                <w:rtl w:val="0"/>
+              </w:rPr>
+              <w:t xml:space="preserve">2. Hay que entregar valor por partes.</w:t>
+            </w:r>
+            <w:r>
+              <w:rPr>
+                <w:i w:val="1"/>
+                <w:iCs w:val="1"/>
+                <w:rtl w:val="0"/>
+              </w:rPr>
+              <w:t xml:space="preserve"> El producto se construye en etapas que ya se pueden usar y mostrar: primero el inicio de sesión y los vehículos, luego conductores, documentos, avisos y turnos, y al final el módulo opcional de ingresos. Así podemos validar cada parte con la docente antes de seguir.</w:t>
+            </w:r>
+          </w:p>
+          <w:p>
+            <w:pPr>
+              <w:spacing w:after="240" w:before="240" w:lineRule="auto"/>
+              <w:jc w:val="both"/>
+              <w:rPr>
+                <w:i w:val="1"/>
+                <w:iCs w:val="1"/>
+              </w:rPr>
+            </w:pPr>
+            <w:r>
+              <w:rPr>
+                <w:b w:val="1"/>
+                <w:bCs w:val="1"/>
+                <w:i w:val="1"/>
+                <w:iCs w:val="1"/>
+                <w:rtl w:val="0"/>
+              </w:rPr>
+              <w:t xml:space="preserve">3. El plazo es fijo y el equipo es pequeño.</w:t>
+            </w:r>
+            <w:r>
+              <w:rPr>
+                <w:i w:val="1"/>
+                <w:iCs w:val="1"/>
+                <w:rtl w:val="0"/>
+              </w:rPr>
+              <w:t xml:space="preserve"> Son 18 semanas con hitos ya definidos (idea validada en la semana 3, tecnologías en la 6, MVP integrado en la 14 y entrega final en la 18). Un Product Backlog priorizado permite decidir qué entra si el tiempo no alcanza.</w:t>
+            </w:r>
+          </w:p>
+          <w:p>
+            <w:pPr>
+              <w:spacing w:after="240" w:before="240" w:lineRule="auto"/>
+              <w:jc w:val="both"/>
+              <w:rPr>
+                <w:i w:val="1"/>
+                <w:iCs w:val="1"/>
+              </w:rPr>
+            </w:pPr>
+            <w:r>
+              <w:rPr>
+                <w:b w:val="1"/>
+                <w:bCs w:val="1"/>
+                <w:i w:val="1"/>
+                <w:iCs w:val="1"/>
+                <w:rtl w:val="0"/>
+              </w:rPr>
+              <w:t xml:space="preserve">4. Los roles calzan con el equipo.</w:t>
+            </w:r>
+            <w:r>
+              <w:rPr>
+                <w:i w:val="1"/>
+                <w:iCs w:val="1"/>
+                <w:rtl w:val="0"/>
+              </w:rPr>
+              <w:t xml:space="preserve"> Un Product Owner que prioriza, un Scrum Master que organiza el trabajo y un Developer, con los tres participando en todas las etapas.</w:t>
+            </w:r>
+          </w:p>
+          <w:p>
+            <w:pPr>
+              <w:spacing w:after="240" w:before="240" w:lineRule="auto"/>
+              <w:jc w:val="both"/>
+              <w:rPr>
+                <w:i w:val="1"/>
+                <w:iCs w:val="1"/>
+              </w:rPr>
+            </w:pPr>
+            <w:r>
+              <w:rPr>
+                <w:i w:val="1"/>
+                <w:iCs w:val="1"/>
+                <w:rtl w:val="0"/>
+              </w:rPr>
+              <w:t xml:space="preserve">Para aplicarla usaremos los artefactos y eventos de Scrum adaptados a un equipo de tres: Product Vision, Product Backlog, Sprint Backlog por iteración, Definition of Done, reunión semanal de seguimiento y una retrospectiva al cierre de cada sprint.</w:t>
             </w:r>
           </w:p>
         </w:tc>

</xml_diff>